<commit_message>
Move site to cjneale.xyz
- Every site URL (resume header and project links, recruiter links, chat
  and attribution defaults) now points at https://cjneale.xyz; resumes rebuilt.
- vercel.json 308-redirects the old cjportfolio-inky.vercel.app host to the
  same path on the new domain so links already sent keep working.

Co-Authored-By: Claude Opus 5.5 <noreply@anthropic.com>
</commit_message>
<xml_diff>
--- a/resumes/general.docx
+++ b/resumes/general.docx
@@ -63,7 +63,7 @@
         </w:rPr>
         <w:t xml:space="preserve">cjneale.analyst@gmail.com  |  </w:t>
       </w:r>
-      <w:hyperlink w:history="1" r:id="rIdepgtkteaz-tkzcigt4stk">
+      <w:hyperlink w:history="1" r:id="rIdlsjabj9tccmsh2o5syt30">
         <w:r>
           <w:rPr>
             <w:rFonts w:ascii="Calibri" w:cs="Calibri" w:eastAsia="Calibri" w:hAnsi="Calibri"/>
@@ -83,7 +83,7 @@
         </w:rPr>
         <w:t xml:space="preserve">  |  </w:t>
       </w:r>
-      <w:hyperlink w:history="1" r:id="rIdjknlzmhllhcz5awllku5a">
+      <w:hyperlink w:history="1" r:id="rIdmnwg9n-qhdl2mpcyrm6hw">
         <w:r>
           <w:rPr>
             <w:rFonts w:ascii="Calibri" w:cs="Calibri" w:eastAsia="Calibri" w:hAnsi="Calibri"/>
@@ -92,7 +92,7 @@
             <w:szCs w:val="19"/>
             <w:u w:val="single"/>
           </w:rPr>
-          <w:t xml:space="preserve">cjportfolio-inky.vercel.app</w:t>
+          <w:t xml:space="preserve">cjneale.xyz</w:t>
         </w:r>
       </w:hyperlink>
     </w:p>
@@ -686,7 +686,7 @@
         <w:spacing w:after="30"/>
         <w:ind w:left="360"/>
       </w:pPr>
-      <w:hyperlink w:history="1" w:anchor="/project/attribution" r:id="rId6oyyp4_gjbbjoelodatjw">
+      <w:hyperlink w:history="1" w:anchor="/project/attribution" r:id="rIduruqb9_jcunnmf5ezyqsa">
         <w:r>
           <w:rPr>
             <w:rFonts w:ascii="Calibri" w:cs="Calibri" w:eastAsia="Calibri" w:hAnsi="Calibri"/>
@@ -695,7 +695,7 @@
             <w:szCs w:val="20"/>
             <w:u w:val="single"/>
           </w:rPr>
-          <w:t xml:space="preserve">https://cjportfolio-inky.vercel.app/#/project/attribution</w:t>
+          <w:t xml:space="preserve">https://cjneale.xyz/#/project/attribution</w:t>
         </w:r>
       </w:hyperlink>
     </w:p>
@@ -755,7 +755,7 @@
         <w:spacing w:after="30"/>
         <w:ind w:left="360"/>
       </w:pPr>
-      <w:hyperlink w:history="1" r:id="rIded-k4xiphh5stp7zed9lw">
+      <w:hyperlink w:history="1" r:id="rId5uwkxlec-1v6e_oglppou">
         <w:r>
           <w:rPr>
             <w:rFonts w:ascii="Calibri" w:cs="Calibri" w:eastAsia="Calibri" w:hAnsi="Calibri"/>
@@ -764,7 +764,7 @@
             <w:szCs w:val="20"/>
             <w:u w:val="single"/>
           </w:rPr>
-          <w:t xml:space="preserve">https://cjportfolio-inky.vercel.app/player.html</w:t>
+          <w:t xml:space="preserve">https://cjneale.xyz/player.html</w:t>
         </w:r>
       </w:hyperlink>
     </w:p>
@@ -824,7 +824,7 @@
         <w:spacing w:after="30"/>
         <w:ind w:left="360"/>
       </w:pPr>
-      <w:hyperlink w:history="1" r:id="rIdievjpxnudwsqesct-m7nk">
+      <w:hyperlink w:history="1" r:id="rId8pqx_fw9ykegt6bxtbp41">
         <w:r>
           <w:rPr>
             <w:rFonts w:ascii="Calibri" w:cs="Calibri" w:eastAsia="Calibri" w:hAnsi="Calibri"/>

</xml_diff>